<commit_message>
Site updated: 2022-10-01 21:03:41
</commit_message>
<xml_diff>
--- a/treasure/download/经藏/本缘部-72部/过去现在因果经-刘宋-求那跋陀罗.docx
+++ b/treasure/download/经藏/本缘部-72部/过去现在因果经-刘宋-求那跋陀罗.docx
@@ -19303,7 +19303,6 @@
         <w:ind w:firstLineChars="200" w:firstLine="480"/>
         <w:jc w:val="both"/>
         <w:rPr>
-          <w:rFonts w:hint="eastAsia"/>
           <w:sz w:val="24"/>
           <w:szCs w:val="24"/>
           <w:shd w:val="pct15" w:color="auto" w:fill="FFFFFF"/>
@@ -20706,45 +20705,87 @@
           <w:lang w:eastAsia="zh-CN"/>
         </w:rPr>
       </w:pPr>
-    </w:p>
-    <w:p>
-      <w:pPr>
-        <w:spacing w:after="0" w:line="240" w:lineRule="auto"/>
-        <w:ind w:firstLineChars="200" w:firstLine="480"/>
-        <w:jc w:val="both"/>
-        <w:rPr>
-          <w:sz w:val="24"/>
-          <w:szCs w:val="24"/>
-          <w:shd w:val="pct15" w:color="auto" w:fill="FFFFFF"/>
-          <w:lang w:eastAsia="zh-CN"/>
-        </w:rPr>
-      </w:pPr>
-    </w:p>
-    <w:p>
-      <w:pPr>
-        <w:spacing w:after="0" w:line="240" w:lineRule="auto"/>
-        <w:ind w:firstLineChars="200" w:firstLine="480"/>
-        <w:jc w:val="both"/>
-        <w:rPr>
-          <w:sz w:val="24"/>
-          <w:szCs w:val="24"/>
-          <w:shd w:val="pct15" w:color="auto" w:fill="FFFFFF"/>
-          <w:lang w:eastAsia="zh-CN"/>
-        </w:rPr>
-      </w:pPr>
-    </w:p>
-    <w:p>
-      <w:pPr>
-        <w:spacing w:after="0" w:line="240" w:lineRule="auto"/>
-        <w:ind w:firstLineChars="200" w:firstLine="480"/>
-        <w:jc w:val="both"/>
-        <w:rPr>
-          <w:sz w:val="24"/>
-          <w:szCs w:val="24"/>
-          <w:shd w:val="pct15" w:color="auto" w:fill="FFFFFF"/>
-          <w:lang w:eastAsia="zh-CN"/>
-        </w:rPr>
-      </w:pPr>
+      <w:r>
+        <w:rPr>
+          <w:sz w:val="24"/>
+          <w:szCs w:val="24"/>
+          <w:shd w:val="pct15" w:color="auto" w:fill="FFFFFF"/>
+          <w:lang w:eastAsia="zh-CN"/>
+        </w:rPr>
+        <w:lastRenderedPageBreak/>
+        <w:t>尔时世</w:t>
+      </w:r>
+      <w:r>
+        <w:rPr>
+          <w:sz w:val="24"/>
+          <w:szCs w:val="24"/>
+          <w:shd w:val="pct15" w:color="auto" w:fill="FFFFFF"/>
+          <w:lang w:eastAsia="zh-CN"/>
+        </w:rPr>
+        <w:t>尊答大梵天王及释提桓因等言。我亦欲为一切众生转于法轮。但所得法微妙甚深难解难知。诸众生等不能信受。生诽谤心堕于地狱。我今为此故</w:t>
+      </w:r>
+      <w:r>
+        <w:rPr>
+          <w:sz w:val="24"/>
+          <w:szCs w:val="24"/>
+          <w:shd w:val="pct15" w:color="auto" w:fill="FFFFFF"/>
+          <w:lang w:eastAsia="zh-CN"/>
+        </w:rPr>
+        <w:t>默然耳。</w:t>
+      </w:r>
+    </w:p>
+    <w:p>
+      <w:pPr>
+        <w:spacing w:after="0" w:line="240" w:lineRule="auto"/>
+        <w:ind w:firstLineChars="200" w:firstLine="480"/>
+        <w:jc w:val="both"/>
+        <w:rPr>
+          <w:sz w:val="24"/>
+          <w:szCs w:val="24"/>
+          <w:shd w:val="pct15" w:color="auto" w:fill="FFFFFF"/>
+          <w:lang w:eastAsia="zh-CN"/>
+        </w:rPr>
+      </w:pPr>
+      <w:r>
+        <w:rPr>
+          <w:sz w:val="24"/>
+          <w:szCs w:val="24"/>
+          <w:shd w:val="pct15" w:color="auto" w:fill="FFFFFF"/>
+          <w:lang w:eastAsia="zh-CN"/>
+        </w:rPr>
+        <w:t>时梵天王等乃至三请。尔时如来至满七日。默然受之。梵天王等</w:t>
+      </w:r>
+      <w:r>
+        <w:rPr>
+          <w:sz w:val="24"/>
+          <w:szCs w:val="24"/>
+          <w:shd w:val="pct15" w:color="auto" w:fill="FFFFFF"/>
+          <w:lang w:eastAsia="zh-CN"/>
+        </w:rPr>
+        <w:t>知佛受请。头面礼足。各还所住。</w:t>
+      </w:r>
+    </w:p>
+    <w:p>
+      <w:pPr>
+        <w:spacing w:after="0" w:line="240" w:lineRule="auto"/>
+        <w:ind w:firstLineChars="200" w:firstLine="480"/>
+        <w:jc w:val="both"/>
+        <w:rPr>
+          <w:sz w:val="24"/>
+          <w:szCs w:val="24"/>
+          <w:shd w:val="pct15" w:color="auto" w:fill="FFFFFF"/>
+          <w:lang w:eastAsia="zh-CN"/>
+        </w:rPr>
+      </w:pPr>
+      <w:r>
+        <w:rPr>
+          <w:sz w:val="24"/>
+          <w:szCs w:val="24"/>
+          <w:shd w:val="pct15" w:color="auto" w:fill="FFFFFF"/>
+          <w:lang w:eastAsia="zh-CN"/>
+        </w:rPr>
+        <w:t>尔时世尊受梵王等请已。又于七日。而以佛眼观诸众生上中下根</w:t>
+      </w:r>
       <w:r>
         <w:rPr>
           <w:rFonts w:hint="eastAsia"/>
@@ -20753,234 +20794,841 @@
           <w:shd w:val="pct15" w:color="auto" w:fill="FFFFFF"/>
           <w:lang w:eastAsia="zh-CN"/>
         </w:rPr>
-        <w:t>0</w:t>
-      </w:r>
-      <w:r>
-        <w:rPr>
-          <w:sz w:val="24"/>
-          <w:szCs w:val="24"/>
-          <w:shd w:val="pct15" w:color="auto" w:fill="FFFFFF"/>
-          <w:lang w:eastAsia="zh-CN"/>
-        </w:rPr>
-        <w:t>000</w:t>
+        <w:t>。</w:t>
+      </w:r>
+      <w:r>
+        <w:rPr>
+          <w:sz w:val="24"/>
+          <w:szCs w:val="24"/>
+          <w:shd w:val="pct15" w:color="auto" w:fill="FFFFFF"/>
+          <w:lang w:eastAsia="zh-CN"/>
+        </w:rPr>
+        <w:t>及诸烦恼亦下中上</w:t>
+      </w:r>
+      <w:r>
+        <w:rPr>
+          <w:rFonts w:hint="eastAsia"/>
+          <w:sz w:val="24"/>
+          <w:szCs w:val="24"/>
+          <w:shd w:val="pct15" w:color="auto" w:fill="FFFFFF"/>
+          <w:lang w:eastAsia="zh-CN"/>
+        </w:rPr>
+        <w:t>。</w:t>
+      </w:r>
+      <w:r>
+        <w:rPr>
+          <w:sz w:val="24"/>
+          <w:szCs w:val="24"/>
+          <w:shd w:val="pct15" w:color="auto" w:fill="FFFFFF"/>
+          <w:lang w:eastAsia="zh-CN"/>
+        </w:rPr>
+        <w:t>满二七日。尔时世尊又复思惟。我今当开甘露法门。谁应在先而得闻者。阿罗逻仙人</w:t>
+      </w:r>
+      <w:r>
+        <w:rPr>
+          <w:sz w:val="24"/>
+          <w:szCs w:val="24"/>
+          <w:shd w:val="pct15" w:color="auto" w:fill="FFFFFF"/>
+          <w:lang w:eastAsia="zh-CN"/>
+        </w:rPr>
+        <w:t>聪慧易悟。又先发愿道成度我。</w:t>
+      </w:r>
+    </w:p>
+    <w:p>
+      <w:pPr>
+        <w:spacing w:after="0" w:line="240" w:lineRule="auto"/>
+        <w:ind w:firstLineChars="200" w:firstLine="480"/>
+        <w:jc w:val="both"/>
+        <w:rPr>
+          <w:sz w:val="24"/>
+          <w:szCs w:val="24"/>
+          <w:shd w:val="pct15" w:color="auto" w:fill="FFFFFF"/>
+          <w:lang w:eastAsia="zh-CN"/>
+        </w:rPr>
+      </w:pPr>
+      <w:r>
+        <w:rPr>
+          <w:sz w:val="24"/>
+          <w:szCs w:val="24"/>
+          <w:shd w:val="pct15" w:color="auto" w:fill="FFFFFF"/>
+          <w:lang w:eastAsia="zh-CN"/>
+        </w:rPr>
+        <w:t>作是念时。空中有言。阿罗逻仙人</w:t>
+      </w:r>
+      <w:r>
+        <w:rPr>
+          <w:sz w:val="24"/>
+          <w:szCs w:val="24"/>
+          <w:shd w:val="pct15" w:color="auto" w:fill="FFFFFF"/>
+          <w:lang w:eastAsia="zh-CN"/>
+        </w:rPr>
+        <w:t>昨夜命终。</w:t>
+      </w:r>
+    </w:p>
+    <w:p>
+      <w:pPr>
+        <w:spacing w:after="0" w:line="240" w:lineRule="auto"/>
+        <w:ind w:firstLineChars="200" w:firstLine="480"/>
+        <w:jc w:val="both"/>
+        <w:rPr>
+          <w:sz w:val="24"/>
+          <w:szCs w:val="24"/>
+          <w:shd w:val="pct15" w:color="auto" w:fill="FFFFFF"/>
+          <w:lang w:eastAsia="zh-CN"/>
+        </w:rPr>
+      </w:pPr>
+      <w:r>
+        <w:rPr>
+          <w:sz w:val="24"/>
+          <w:szCs w:val="24"/>
+          <w:shd w:val="pct15" w:color="auto" w:fill="FFFFFF"/>
+          <w:lang w:eastAsia="zh-CN"/>
+        </w:rPr>
+        <w:t>尔时世尊</w:t>
+      </w:r>
+      <w:r>
+        <w:rPr>
+          <w:sz w:val="24"/>
+          <w:szCs w:val="24"/>
+          <w:shd w:val="pct15" w:color="auto" w:fill="FFFFFF"/>
+          <w:lang w:eastAsia="zh-CN"/>
+        </w:rPr>
+        <w:t>即便答彼空中声言。</w:t>
+      </w:r>
+      <w:r>
+        <w:rPr>
+          <w:sz w:val="24"/>
+          <w:szCs w:val="24"/>
+          <w:shd w:val="pct15" w:color="auto" w:fill="FFFFFF"/>
+          <w:lang w:eastAsia="zh-CN"/>
+        </w:rPr>
+        <w:t>我亦知其昨夜命终。又自思惟。迦兰仙人利根明了</w:t>
+      </w:r>
+      <w:r>
+        <w:rPr>
+          <w:sz w:val="24"/>
+          <w:szCs w:val="24"/>
+          <w:shd w:val="pct15" w:color="auto" w:fill="FFFFFF"/>
+          <w:lang w:eastAsia="zh-CN"/>
+        </w:rPr>
+        <w:t>亦应先闻。</w:t>
+      </w:r>
+    </w:p>
+    <w:p>
+      <w:pPr>
+        <w:spacing w:after="0" w:line="240" w:lineRule="auto"/>
+        <w:ind w:firstLineChars="200" w:firstLine="480"/>
+        <w:jc w:val="both"/>
+        <w:rPr>
+          <w:sz w:val="24"/>
+          <w:szCs w:val="24"/>
+          <w:shd w:val="pct15" w:color="auto" w:fill="FFFFFF"/>
+          <w:lang w:eastAsia="zh-CN"/>
+        </w:rPr>
+      </w:pPr>
+      <w:r>
+        <w:rPr>
+          <w:sz w:val="24"/>
+          <w:szCs w:val="24"/>
+          <w:shd w:val="pct15" w:color="auto" w:fill="FFFFFF"/>
+          <w:lang w:eastAsia="zh-CN"/>
+        </w:rPr>
+        <w:t>空中又言。迦兰仙人</w:t>
+      </w:r>
+      <w:r>
+        <w:rPr>
+          <w:sz w:val="24"/>
+          <w:szCs w:val="24"/>
+          <w:shd w:val="pct15" w:color="auto" w:fill="FFFFFF"/>
+          <w:lang w:eastAsia="zh-CN"/>
+        </w:rPr>
+        <w:t>昨夜命终。</w:t>
+      </w:r>
+    </w:p>
+    <w:p>
+      <w:pPr>
+        <w:spacing w:after="0" w:line="240" w:lineRule="auto"/>
+        <w:ind w:firstLineChars="200" w:firstLine="480"/>
+        <w:jc w:val="both"/>
+        <w:rPr>
+          <w:sz w:val="24"/>
+          <w:szCs w:val="24"/>
+          <w:shd w:val="pct15" w:color="auto" w:fill="FFFFFF"/>
+          <w:lang w:eastAsia="zh-CN"/>
+        </w:rPr>
+      </w:pPr>
+      <w:r>
+        <w:rPr>
+          <w:sz w:val="24"/>
+          <w:szCs w:val="24"/>
+          <w:shd w:val="pct15" w:color="auto" w:fill="FFFFFF"/>
+          <w:lang w:eastAsia="zh-CN"/>
+        </w:rPr>
+        <w:t>尔时世尊</w:t>
+      </w:r>
+      <w:r>
+        <w:rPr>
+          <w:sz w:val="24"/>
+          <w:szCs w:val="24"/>
+          <w:shd w:val="pct15" w:color="auto" w:fill="FFFFFF"/>
+          <w:lang w:eastAsia="zh-CN"/>
+        </w:rPr>
+        <w:t>即复答言。我亦知其昨夜命终。</w:t>
+      </w:r>
+    </w:p>
+    <w:p>
+      <w:pPr>
+        <w:spacing w:after="0" w:line="240" w:lineRule="auto"/>
+        <w:ind w:firstLineChars="200" w:firstLine="480"/>
+        <w:jc w:val="both"/>
+        <w:rPr>
+          <w:sz w:val="24"/>
+          <w:szCs w:val="24"/>
+          <w:shd w:val="pct15" w:color="auto" w:fill="FFFFFF"/>
+          <w:lang w:eastAsia="zh-CN"/>
+        </w:rPr>
+      </w:pPr>
+      <w:r>
+        <w:rPr>
+          <w:sz w:val="24"/>
+          <w:szCs w:val="24"/>
+          <w:shd w:val="pct15" w:color="auto" w:fill="FFFFFF"/>
+          <w:lang w:eastAsia="zh-CN"/>
+        </w:rPr>
+        <w:t>尔时世尊又自思惟。彼王师大臣所遣憍陈如等五人瞻视我者。皆悉聪明。又过去世</w:t>
+      </w:r>
+      <w:r>
+        <w:rPr>
+          <w:sz w:val="24"/>
+          <w:szCs w:val="24"/>
+          <w:shd w:val="pct15" w:color="auto" w:fill="FFFFFF"/>
+          <w:lang w:eastAsia="zh-CN"/>
+        </w:rPr>
+        <w:t>于我发愿应先闻法。我今宜当为此五人先开法门。</w:t>
+      </w:r>
+    </w:p>
+    <w:p>
+      <w:pPr>
+        <w:spacing w:after="0" w:line="240" w:lineRule="auto"/>
+        <w:ind w:firstLineChars="200" w:firstLine="480"/>
+        <w:jc w:val="both"/>
+        <w:rPr>
+          <w:sz w:val="24"/>
+          <w:szCs w:val="24"/>
+          <w:shd w:val="pct15" w:color="auto" w:fill="FFFFFF"/>
+          <w:lang w:eastAsia="zh-CN"/>
+        </w:rPr>
+      </w:pPr>
+      <w:r>
+        <w:rPr>
+          <w:sz w:val="24"/>
+          <w:szCs w:val="24"/>
+          <w:shd w:val="pct15" w:color="auto" w:fill="FFFFFF"/>
+          <w:lang w:eastAsia="zh-CN"/>
+        </w:rPr>
+        <w:t>又自思惟。古昔诸佛转法轮处。皆悉在于婆罗奈国鹿野苑中仙人住处</w:t>
+      </w:r>
+      <w:r>
+        <w:rPr>
+          <w:rFonts w:hint="eastAsia"/>
+          <w:sz w:val="24"/>
+          <w:szCs w:val="24"/>
+          <w:shd w:val="pct15" w:color="auto" w:fill="FFFFFF"/>
+          <w:lang w:eastAsia="zh-CN"/>
+        </w:rPr>
+        <w:t>。</w:t>
+      </w:r>
+      <w:r>
+        <w:rPr>
+          <w:sz w:val="24"/>
+          <w:szCs w:val="24"/>
+          <w:shd w:val="pct15" w:color="auto" w:fill="FFFFFF"/>
+          <w:lang w:eastAsia="zh-CN"/>
+        </w:rPr>
+        <w:t>又此五人所止住处亦在于彼。我今应往至其住处</w:t>
+      </w:r>
+      <w:r>
+        <w:rPr>
+          <w:sz w:val="24"/>
+          <w:szCs w:val="24"/>
+          <w:shd w:val="pct15" w:color="auto" w:fill="FFFFFF"/>
+          <w:lang w:eastAsia="zh-CN"/>
+        </w:rPr>
+        <w:t>转大法轮。思惟是已。即从座起。诣婆罗奈国。</w:t>
+      </w:r>
+    </w:p>
+    <w:p>
+      <w:pPr>
+        <w:spacing w:after="0" w:line="240" w:lineRule="auto"/>
+        <w:ind w:firstLineChars="200" w:firstLine="480"/>
+        <w:jc w:val="both"/>
+        <w:rPr>
+          <w:sz w:val="24"/>
+          <w:szCs w:val="24"/>
+          <w:shd w:val="pct15" w:color="auto" w:fill="FFFFFF"/>
+          <w:lang w:eastAsia="zh-CN"/>
+        </w:rPr>
+      </w:pPr>
+      <w:r>
+        <w:rPr>
+          <w:sz w:val="24"/>
+          <w:szCs w:val="24"/>
+          <w:shd w:val="pct15" w:color="auto" w:fill="FFFFFF"/>
+          <w:lang w:eastAsia="zh-CN"/>
+        </w:rPr>
+        <w:t>尔时有五百商</w:t>
+      </w:r>
+      <w:r>
+        <w:rPr>
+          <w:sz w:val="24"/>
+          <w:szCs w:val="24"/>
+          <w:shd w:val="pct15" w:color="auto" w:fill="FFFFFF"/>
+          <w:lang w:eastAsia="zh-CN"/>
+        </w:rPr>
+        <w:t>人。二人为主。一名跋陀罗斯那。二名跋陀罗梨。行过旷野。</w:t>
+      </w:r>
+    </w:p>
+    <w:p>
+      <w:pPr>
+        <w:spacing w:after="0" w:line="240" w:lineRule="auto"/>
+        <w:ind w:firstLineChars="200" w:firstLine="480"/>
+        <w:jc w:val="both"/>
+        <w:rPr>
+          <w:sz w:val="24"/>
+          <w:szCs w:val="24"/>
+          <w:shd w:val="pct15" w:color="auto" w:fill="FFFFFF"/>
+          <w:lang w:eastAsia="zh-CN"/>
+        </w:rPr>
+      </w:pPr>
+      <w:r>
+        <w:rPr>
+          <w:sz w:val="24"/>
+          <w:szCs w:val="24"/>
+          <w:shd w:val="pct15" w:color="auto" w:fill="FFFFFF"/>
+          <w:lang w:eastAsia="zh-CN"/>
+        </w:rPr>
+        <w:t>时有天神</w:t>
+      </w:r>
+      <w:r>
+        <w:rPr>
+          <w:sz w:val="24"/>
+          <w:szCs w:val="24"/>
+          <w:shd w:val="pct15" w:color="auto" w:fill="FFFFFF"/>
+          <w:lang w:eastAsia="zh-CN"/>
+        </w:rPr>
+        <w:t>而语之言。有如来应供正遍知明行足善逝世间解无上士调御丈夫天人师佛世尊。出兴于世。最上福田。汝今宜应最前设供。</w:t>
+      </w:r>
+    </w:p>
+    <w:p>
+      <w:pPr>
+        <w:spacing w:after="0" w:line="240" w:lineRule="auto"/>
+        <w:ind w:firstLineChars="200" w:firstLine="480"/>
+        <w:jc w:val="both"/>
+        <w:rPr>
+          <w:sz w:val="24"/>
+          <w:szCs w:val="24"/>
+          <w:shd w:val="pct15" w:color="auto" w:fill="FFFFFF"/>
+          <w:lang w:eastAsia="zh-CN"/>
+        </w:rPr>
+      </w:pPr>
+      <w:r>
+        <w:rPr>
+          <w:sz w:val="24"/>
+          <w:szCs w:val="24"/>
+          <w:shd w:val="pct15" w:color="auto" w:fill="FFFFFF"/>
+          <w:lang w:eastAsia="zh-CN"/>
+        </w:rPr>
+        <w:t>时彼商人</w:t>
+      </w:r>
+      <w:r>
+        <w:rPr>
+          <w:sz w:val="24"/>
+          <w:szCs w:val="24"/>
+          <w:shd w:val="pct15" w:color="auto" w:fill="FFFFFF"/>
+          <w:lang w:eastAsia="zh-CN"/>
+        </w:rPr>
+        <w:t>闻天语已。即答之曰。善哉如告。又问天言。世尊今者为在何许。</w:t>
+      </w:r>
+    </w:p>
+    <w:p>
+      <w:pPr>
+        <w:spacing w:after="0" w:line="240" w:lineRule="auto"/>
+        <w:ind w:firstLineChars="200" w:firstLine="480"/>
+        <w:jc w:val="both"/>
+        <w:rPr>
+          <w:sz w:val="24"/>
+          <w:szCs w:val="24"/>
+          <w:shd w:val="pct15" w:color="auto" w:fill="FFFFFF"/>
+          <w:lang w:eastAsia="zh-CN"/>
+        </w:rPr>
+      </w:pPr>
+      <w:r>
+        <w:rPr>
+          <w:sz w:val="24"/>
+          <w:szCs w:val="24"/>
+          <w:shd w:val="pct15" w:color="auto" w:fill="FFFFFF"/>
+          <w:lang w:eastAsia="zh-CN"/>
+        </w:rPr>
+        <w:t>天又报言。世尊不久当来至此。</w:t>
+      </w:r>
+    </w:p>
+    <w:p>
+      <w:pPr>
+        <w:spacing w:after="0" w:line="240" w:lineRule="auto"/>
+        <w:ind w:firstLineChars="200" w:firstLine="480"/>
+        <w:jc w:val="both"/>
+        <w:rPr>
+          <w:sz w:val="24"/>
+          <w:szCs w:val="24"/>
+          <w:shd w:val="pct15" w:color="auto" w:fill="FFFFFF"/>
+          <w:lang w:eastAsia="zh-CN"/>
+        </w:rPr>
+      </w:pPr>
+      <w:r>
+        <w:rPr>
+          <w:sz w:val="24"/>
+          <w:szCs w:val="24"/>
+          <w:shd w:val="pct15" w:color="auto" w:fill="FFFFFF"/>
+          <w:lang w:eastAsia="zh-CN"/>
+        </w:rPr>
+        <w:t>于是如来与无量诸天前后导从。到多谓娑跋利村。</w:t>
+      </w:r>
+    </w:p>
+    <w:p>
+      <w:pPr>
+        <w:spacing w:after="0" w:line="240" w:lineRule="auto"/>
+        <w:ind w:firstLineChars="200" w:firstLine="480"/>
+        <w:jc w:val="both"/>
+        <w:rPr>
+          <w:sz w:val="24"/>
+          <w:szCs w:val="24"/>
+          <w:shd w:val="pct15" w:color="auto" w:fill="FFFFFF"/>
+          <w:lang w:eastAsia="zh-CN"/>
+        </w:rPr>
+      </w:pPr>
+      <w:r>
+        <w:rPr>
+          <w:sz w:val="24"/>
+          <w:szCs w:val="24"/>
+          <w:shd w:val="pct15" w:color="auto" w:fill="FFFFFF"/>
+          <w:lang w:eastAsia="zh-CN"/>
+        </w:rPr>
+        <w:t>时彼商人既见如来威相庄严。又见诸天前后围绕。倍生欢喜。即以蜜麨</w:t>
+      </w:r>
+      <w:r>
+        <w:rPr>
+          <w:sz w:val="24"/>
+          <w:szCs w:val="24"/>
+          <w:shd w:val="pct15" w:color="auto" w:fill="FFFFFF"/>
+          <w:lang w:eastAsia="zh-CN"/>
+        </w:rPr>
+        <w:t>而奉上佛。</w:t>
+      </w:r>
+    </w:p>
+    <w:p>
+      <w:pPr>
+        <w:spacing w:after="0" w:line="240" w:lineRule="auto"/>
+        <w:ind w:firstLineChars="200" w:firstLine="480"/>
+        <w:jc w:val="both"/>
+        <w:rPr>
+          <w:sz w:val="24"/>
+          <w:szCs w:val="24"/>
+          <w:shd w:val="pct15" w:color="auto" w:fill="FFFFFF"/>
+          <w:lang w:eastAsia="zh-CN"/>
+        </w:rPr>
+      </w:pPr>
+      <w:r>
+        <w:rPr>
+          <w:sz w:val="24"/>
+          <w:szCs w:val="24"/>
+          <w:shd w:val="pct15" w:color="auto" w:fill="FFFFFF"/>
+          <w:lang w:eastAsia="zh-CN"/>
+        </w:rPr>
+        <w:t>尔时世尊心自思惟。过去诸佛用钵多罗而以盛食。</w:t>
+      </w:r>
+    </w:p>
+    <w:p>
+      <w:pPr>
+        <w:spacing w:after="0" w:line="240" w:lineRule="auto"/>
+        <w:ind w:firstLineChars="200" w:firstLine="480"/>
+        <w:jc w:val="both"/>
+        <w:rPr>
+          <w:sz w:val="24"/>
+          <w:szCs w:val="24"/>
+          <w:shd w:val="pct15" w:color="auto" w:fill="FFFFFF"/>
+          <w:lang w:eastAsia="zh-CN"/>
+        </w:rPr>
+      </w:pPr>
+      <w:r>
+        <w:rPr>
+          <w:sz w:val="24"/>
+          <w:szCs w:val="24"/>
+          <w:shd w:val="pct15" w:color="auto" w:fill="FFFFFF"/>
+          <w:lang w:eastAsia="zh-CN"/>
+        </w:rPr>
+        <w:t>时四天王知佛心念。各持一钵来至佛所</w:t>
+      </w:r>
+      <w:r>
+        <w:rPr>
+          <w:sz w:val="24"/>
+          <w:szCs w:val="24"/>
+          <w:shd w:val="pct15" w:color="auto" w:fill="FFFFFF"/>
+          <w:lang w:eastAsia="zh-CN"/>
+        </w:rPr>
+        <w:t>而以奉上。</w:t>
+      </w:r>
+    </w:p>
+    <w:p>
+      <w:pPr>
+        <w:spacing w:after="0" w:line="240" w:lineRule="auto"/>
+        <w:ind w:firstLineChars="200" w:firstLine="480"/>
+        <w:jc w:val="both"/>
+        <w:rPr>
+          <w:sz w:val="24"/>
+          <w:szCs w:val="24"/>
+          <w:shd w:val="pct15" w:color="auto" w:fill="FFFFFF"/>
+          <w:lang w:eastAsia="zh-CN"/>
+        </w:rPr>
+      </w:pPr>
+      <w:r>
+        <w:rPr>
+          <w:sz w:val="24"/>
+          <w:szCs w:val="24"/>
+          <w:shd w:val="pct15" w:color="auto" w:fill="FFFFFF"/>
+          <w:lang w:eastAsia="zh-CN"/>
+        </w:rPr>
+        <w:t>于是世尊</w:t>
+      </w:r>
+      <w:r>
+        <w:rPr>
+          <w:sz w:val="24"/>
+          <w:szCs w:val="24"/>
+          <w:shd w:val="pct15" w:color="auto" w:fill="FFFFFF"/>
+          <w:lang w:eastAsia="zh-CN"/>
+        </w:rPr>
+        <w:t>而自念言。</w:t>
+      </w:r>
+      <w:r>
+        <w:rPr>
+          <w:sz w:val="24"/>
+          <w:szCs w:val="24"/>
+          <w:shd w:val="pct15" w:color="auto" w:fill="FFFFFF"/>
+          <w:lang w:eastAsia="zh-CN"/>
+        </w:rPr>
+        <w:t>我今若受一王钵者。余王必当生于恨心。即便普受四王之钵。累置掌上</w:t>
+      </w:r>
+      <w:r>
+        <w:rPr>
+          <w:rFonts w:hint="eastAsia"/>
+          <w:sz w:val="24"/>
+          <w:szCs w:val="24"/>
+          <w:shd w:val="pct15" w:color="auto" w:fill="FFFFFF"/>
+          <w:lang w:eastAsia="zh-CN"/>
+        </w:rPr>
+        <w:t>。</w:t>
+      </w:r>
+      <w:r>
+        <w:rPr>
+          <w:sz w:val="24"/>
+          <w:szCs w:val="24"/>
+          <w:shd w:val="pct15" w:color="auto" w:fill="FFFFFF"/>
+          <w:lang w:eastAsia="zh-CN"/>
+        </w:rPr>
+        <w:t>按令成一。使四际现。</w:t>
+      </w:r>
+    </w:p>
+    <w:p>
+      <w:pPr>
+        <w:spacing w:after="0" w:line="240" w:lineRule="auto"/>
+        <w:ind w:firstLineChars="200" w:firstLine="480"/>
+        <w:jc w:val="both"/>
+        <w:rPr>
+          <w:sz w:val="24"/>
+          <w:szCs w:val="24"/>
+          <w:shd w:val="pct15" w:color="auto" w:fill="FFFFFF"/>
+          <w:lang w:eastAsia="zh-CN"/>
+        </w:rPr>
+      </w:pPr>
+      <w:r>
+        <w:rPr>
+          <w:sz w:val="24"/>
+          <w:szCs w:val="24"/>
+          <w:shd w:val="pct15" w:color="auto" w:fill="FFFFFF"/>
+          <w:lang w:eastAsia="zh-CN"/>
+        </w:rPr>
+        <w:t>尔时世尊即便咒愿。今所布施。欲令食者得充气力。当令施者得色得力。得胆得喜。安快无病。终保年寿。诸善鬼神恒随守护。饭食布施断三毒根。将来当获三坚法报。聪明智慧。笃信佛法。在在所生正见不昧。现世之中父母妻子亲戚眷属</w:t>
+      </w:r>
+      <w:r>
+        <w:rPr>
+          <w:sz w:val="24"/>
+          <w:szCs w:val="24"/>
+          <w:shd w:val="pct15" w:color="auto" w:fill="FFFFFF"/>
+          <w:lang w:eastAsia="zh-CN"/>
+        </w:rPr>
+        <w:t>皆悉炽盛。无诸</w:t>
+      </w:r>
+      <w:r>
+        <w:rPr>
+          <w:sz w:val="24"/>
+          <w:szCs w:val="24"/>
+          <w:shd w:val="pct15" w:color="auto" w:fill="FFFFFF"/>
+          <w:lang w:eastAsia="zh-CN"/>
+        </w:rPr>
+        <w:t>灾怪不吉祥事。门族之中</w:t>
+      </w:r>
+      <w:r>
+        <w:rPr>
+          <w:sz w:val="24"/>
+          <w:szCs w:val="24"/>
+          <w:shd w:val="pct15" w:color="auto" w:fill="FFFFFF"/>
+          <w:lang w:eastAsia="zh-CN"/>
+        </w:rPr>
+        <w:t>若有命过堕</w:t>
+      </w:r>
+      <w:r>
+        <w:rPr>
+          <w:sz w:val="24"/>
+          <w:szCs w:val="24"/>
+          <w:shd w:val="pct15" w:color="auto" w:fill="FFFFFF"/>
+          <w:lang w:eastAsia="zh-CN"/>
+        </w:rPr>
+        <w:t>恶道者。当令以今所施之福还生人天。不起邪见。增进功德。常得奉近</w:t>
+      </w:r>
+      <w:r>
+        <w:rPr>
+          <w:sz w:val="24"/>
+          <w:szCs w:val="24"/>
+          <w:shd w:val="pct15" w:color="auto" w:fill="FFFFFF"/>
+          <w:lang w:eastAsia="zh-CN"/>
+        </w:rPr>
+        <w:t>诸佛如来。得闻妙说。见谛得证。所愿具足。</w:t>
+      </w:r>
+    </w:p>
+    <w:p>
+      <w:pPr>
+        <w:spacing w:after="0" w:line="240" w:lineRule="auto"/>
+        <w:ind w:firstLineChars="200" w:firstLine="480"/>
+        <w:jc w:val="both"/>
+        <w:rPr>
+          <w:sz w:val="24"/>
+          <w:szCs w:val="24"/>
+          <w:shd w:val="pct15" w:color="auto" w:fill="FFFFFF"/>
+          <w:lang w:eastAsia="zh-CN"/>
+        </w:rPr>
+      </w:pPr>
+      <w:r>
+        <w:rPr>
+          <w:sz w:val="24"/>
+          <w:szCs w:val="24"/>
+          <w:shd w:val="pct15" w:color="auto" w:fill="FFFFFF"/>
+          <w:lang w:eastAsia="zh-CN"/>
+        </w:rPr>
+        <w:t>尔时世尊咒愿讫已</w:t>
+      </w:r>
+      <w:r>
+        <w:rPr>
+          <w:sz w:val="24"/>
+          <w:szCs w:val="24"/>
+          <w:shd w:val="pct15" w:color="auto" w:fill="FFFFFF"/>
+          <w:lang w:eastAsia="zh-CN"/>
+        </w:rPr>
+        <w:t>即便受食。食既毕竟。澡漱洗钵</w:t>
+      </w:r>
+      <w:r>
+        <w:rPr>
+          <w:rFonts w:hint="eastAsia"/>
+          <w:sz w:val="24"/>
+          <w:szCs w:val="24"/>
+          <w:shd w:val="pct15" w:color="auto" w:fill="FFFFFF"/>
+          <w:lang w:eastAsia="zh-CN"/>
+        </w:rPr>
+        <w:t>。</w:t>
+      </w:r>
+      <w:r>
+        <w:rPr>
+          <w:sz w:val="24"/>
+          <w:szCs w:val="24"/>
+          <w:shd w:val="pct15" w:color="auto" w:fill="FFFFFF"/>
+          <w:lang w:eastAsia="zh-CN"/>
+        </w:rPr>
+        <w:t>即授商人三归。一归依佛。二归依法。三归依将来僧。授三归竟。因与之别。而便前行</w:t>
+      </w:r>
+      <w:r>
+        <w:rPr>
+          <w:rFonts w:hint="eastAsia"/>
+          <w:sz w:val="24"/>
+          <w:szCs w:val="24"/>
+          <w:shd w:val="pct15" w:color="auto" w:fill="FFFFFF"/>
+          <w:lang w:eastAsia="zh-CN"/>
+        </w:rPr>
+        <w:t>。</w:t>
+      </w:r>
+      <w:r>
+        <w:rPr>
+          <w:sz w:val="24"/>
+          <w:szCs w:val="24"/>
+          <w:shd w:val="pct15" w:color="auto" w:fill="FFFFFF"/>
+          <w:lang w:eastAsia="zh-CN"/>
+        </w:rPr>
+        <w:t>威仪庠序步若鹅王。路逢外道。名优波伽。既见如来相好庄严。诸根寂定。叹为奇特。即说偈言。</w:t>
+      </w:r>
+    </w:p>
+    <w:p>
+      <w:pPr>
+        <w:spacing w:after="0" w:line="240" w:lineRule="auto"/>
+        <w:ind w:firstLineChars="200" w:firstLine="480"/>
+        <w:jc w:val="both"/>
+        <w:rPr>
+          <w:sz w:val="24"/>
+          <w:szCs w:val="24"/>
+          <w:shd w:val="pct15" w:color="auto" w:fill="FFFFFF"/>
+          <w:lang w:eastAsia="zh-CN"/>
+        </w:rPr>
+      </w:pPr>
+      <w:r>
+        <w:rPr>
+          <w:sz w:val="24"/>
+          <w:szCs w:val="24"/>
+          <w:shd w:val="pct15" w:color="auto" w:fill="FFFFFF"/>
+          <w:lang w:eastAsia="zh-CN"/>
+        </w:rPr>
+        <w:t>世间诸众生　　皆为三毒缚</w:t>
+      </w:r>
+      <w:r>
+        <w:rPr>
+          <w:rFonts w:hint="eastAsia"/>
+          <w:sz w:val="24"/>
+          <w:szCs w:val="24"/>
+          <w:shd w:val="pct15" w:color="auto" w:fill="FFFFFF"/>
+          <w:lang w:eastAsia="zh-CN"/>
+        </w:rPr>
+        <w:t>。</w:t>
+      </w:r>
+      <w:r>
+        <w:rPr>
+          <w:sz w:val="24"/>
+          <w:szCs w:val="24"/>
+          <w:shd w:val="pct15" w:color="auto" w:fill="FFFFFF"/>
+          <w:lang w:eastAsia="zh-CN"/>
+        </w:rPr>
+        <w:t>诸根又轻躁　　驰荡于外境</w:t>
+      </w:r>
+      <w:r>
+        <w:rPr>
+          <w:rFonts w:hint="eastAsia"/>
+          <w:sz w:val="24"/>
+          <w:szCs w:val="24"/>
+          <w:shd w:val="pct15" w:color="auto" w:fill="FFFFFF"/>
+          <w:lang w:eastAsia="zh-CN"/>
+        </w:rPr>
+        <w:t>。</w:t>
+      </w:r>
+    </w:p>
+    <w:p>
+      <w:pPr>
+        <w:spacing w:after="0" w:line="240" w:lineRule="auto"/>
+        <w:ind w:firstLineChars="200" w:firstLine="480"/>
+        <w:jc w:val="both"/>
+        <w:rPr>
+          <w:sz w:val="24"/>
+          <w:szCs w:val="24"/>
+          <w:shd w:val="pct15" w:color="auto" w:fill="FFFFFF"/>
+          <w:lang w:eastAsia="zh-CN"/>
+        </w:rPr>
+      </w:pPr>
+      <w:r>
+        <w:rPr>
+          <w:sz w:val="24"/>
+          <w:szCs w:val="24"/>
+          <w:shd w:val="pct15" w:color="auto" w:fill="FFFFFF"/>
+          <w:lang w:eastAsia="zh-CN"/>
+        </w:rPr>
+        <w:t>而今见仁者　　诸根极寂静</w:t>
+      </w:r>
+      <w:r>
+        <w:rPr>
+          <w:rFonts w:hint="eastAsia"/>
+          <w:sz w:val="24"/>
+          <w:szCs w:val="24"/>
+          <w:shd w:val="pct15" w:color="auto" w:fill="FFFFFF"/>
+          <w:lang w:eastAsia="zh-CN"/>
+        </w:rPr>
+        <w:t>。</w:t>
+      </w:r>
+      <w:r>
+        <w:rPr>
+          <w:sz w:val="24"/>
+          <w:szCs w:val="24"/>
+          <w:shd w:val="pct15" w:color="auto" w:fill="FFFFFF"/>
+          <w:lang w:eastAsia="zh-CN"/>
+        </w:rPr>
+        <w:t>必到解脱地　　决定无有疑</w:t>
+      </w:r>
+      <w:r>
+        <w:rPr>
+          <w:rFonts w:hint="eastAsia"/>
+          <w:sz w:val="24"/>
+          <w:szCs w:val="24"/>
+          <w:shd w:val="pct15" w:color="auto" w:fill="FFFFFF"/>
+          <w:lang w:eastAsia="zh-CN"/>
+        </w:rPr>
+        <w:t>。</w:t>
+      </w:r>
+    </w:p>
+    <w:p>
+      <w:pPr>
+        <w:spacing w:after="0" w:line="240" w:lineRule="auto"/>
+        <w:ind w:firstLineChars="200" w:firstLine="480"/>
+        <w:jc w:val="both"/>
+        <w:rPr>
+          <w:sz w:val="24"/>
+          <w:szCs w:val="24"/>
+          <w:shd w:val="pct15" w:color="auto" w:fill="FFFFFF"/>
+          <w:lang w:eastAsia="zh-CN"/>
+        </w:rPr>
+      </w:pPr>
+      <w:r>
+        <w:rPr>
+          <w:sz w:val="24"/>
+          <w:szCs w:val="24"/>
+          <w:shd w:val="pct15" w:color="auto" w:fill="FFFFFF"/>
+          <w:lang w:eastAsia="zh-CN"/>
+        </w:rPr>
+        <w:t>仁者所学师　　其姓字何等</w:t>
+      </w:r>
+      <w:r>
+        <w:rPr>
+          <w:rFonts w:hint="eastAsia"/>
+          <w:sz w:val="24"/>
+          <w:szCs w:val="24"/>
+          <w:shd w:val="pct15" w:color="auto" w:fill="FFFFFF"/>
+          <w:lang w:eastAsia="zh-CN"/>
+        </w:rPr>
+        <w:t>。</w:t>
+      </w:r>
+    </w:p>
+    <w:p>
+      <w:pPr>
+        <w:spacing w:after="0" w:line="240" w:lineRule="auto"/>
+        <w:jc w:val="both"/>
+        <w:rPr>
+          <w:sz w:val="24"/>
+          <w:szCs w:val="24"/>
+          <w:shd w:val="pct15" w:color="auto" w:fill="FFFFFF"/>
+          <w:lang w:eastAsia="zh-CN"/>
+        </w:rPr>
+      </w:pPr>
+      <w:r>
+        <w:rPr>
+          <w:sz w:val="24"/>
+          <w:szCs w:val="24"/>
+          <w:shd w:val="pct15" w:color="auto" w:fill="FFFFFF"/>
+          <w:lang w:eastAsia="zh-CN"/>
+        </w:rPr>
+        <w:t>0000000000</w:t>
       </w:r>
       <w:bookmarkStart w:id="0" w:name="_GoBack"/>
       <w:bookmarkEnd w:id="0"/>
-    </w:p>
-    <w:p>
-      <w:pPr>
-        <w:spacing w:after="0" w:line="240" w:lineRule="auto"/>
-        <w:ind w:firstLineChars="200" w:firstLine="480"/>
-        <w:jc w:val="both"/>
-        <w:rPr>
-          <w:sz w:val="24"/>
-          <w:szCs w:val="24"/>
-          <w:shd w:val="pct15" w:color="auto" w:fill="FFFFFF"/>
-          <w:lang w:eastAsia="zh-CN"/>
-        </w:rPr>
-      </w:pPr>
-    </w:p>
-    <w:p>
-      <w:pPr>
-        <w:spacing w:after="0" w:line="240" w:lineRule="auto"/>
-        <w:ind w:firstLineChars="200" w:firstLine="480"/>
-        <w:jc w:val="both"/>
-        <w:rPr>
-          <w:sz w:val="24"/>
-          <w:szCs w:val="24"/>
-          <w:shd w:val="pct15" w:color="auto" w:fill="FFFFFF"/>
-          <w:lang w:eastAsia="zh-CN"/>
-        </w:rPr>
-      </w:pPr>
-      <w:r>
-        <w:rPr>
-          <w:sz w:val="24"/>
-          <w:szCs w:val="24"/>
-          <w:shd w:val="pct15" w:color="auto" w:fill="FFFFFF"/>
-          <w:lang w:eastAsia="zh-CN"/>
-        </w:rPr>
-        <w:t>尔时世尊答大梵天王及释提桓因等言。我亦欲为一切众生转于法轮。但所得法。微妙甚深。难解难知。诸众生等。不能信受。生诽谤心。堕于地狱。我今为此故。默然耳。时梵天王等。乃至三请。尔时如来。至满七日。默然受之。梵天王等。知佛受请。头面礼足。各还所住。</w:t>
-      </w:r>
-    </w:p>
-    <w:p>
-      <w:pPr>
-        <w:spacing w:after="0" w:line="240" w:lineRule="auto"/>
-        <w:jc w:val="both"/>
-        <w:rPr>
-          <w:sz w:val="24"/>
-          <w:szCs w:val="24"/>
-          <w:shd w:val="pct15" w:color="auto" w:fill="FFFFFF"/>
-          <w:lang w:eastAsia="zh-CN"/>
-        </w:rPr>
-      </w:pPr>
-      <w:r>
-        <w:rPr>
-          <w:sz w:val="24"/>
-          <w:szCs w:val="24"/>
-          <w:shd w:val="pct15" w:color="auto" w:fill="FFFFFF"/>
-          <w:lang w:eastAsia="zh-CN"/>
-        </w:rPr>
-        <w:t xml:space="preserve">　　尔时世尊。受梵王等请已。又于七日。而以佛眼。观诸众生。上中下根。及诸烦恼。亦下中上。满二七日。尔时世尊。又复思惟。我今当开甘露法门。谁应在先。而得闻者。阿罗逻仙人。聪慧易悟。又先发愿道成度我。作是念时。空中有言。阿罗逻仙人。昨夜命终。尔时世尊。即便答彼空中声言。我亦知其昨夜命终。又自思惟。迦兰仙人。利根明了。亦应先闻。空中又言。迦兰仙人。昨夜命终。尔时世尊。即复答言。我亦知其昨夜命终。</w:t>
-      </w:r>
-    </w:p>
-    <w:p>
-      <w:pPr>
-        <w:spacing w:after="0" w:line="240" w:lineRule="auto"/>
-        <w:jc w:val="both"/>
-        <w:rPr>
-          <w:sz w:val="24"/>
-          <w:szCs w:val="24"/>
-          <w:shd w:val="pct15" w:color="auto" w:fill="FFFFFF"/>
-          <w:lang w:eastAsia="zh-CN"/>
-        </w:rPr>
-      </w:pPr>
-      <w:r>
-        <w:rPr>
-          <w:sz w:val="24"/>
-          <w:szCs w:val="24"/>
-          <w:shd w:val="pct15" w:color="auto" w:fill="FFFFFF"/>
-          <w:lang w:eastAsia="zh-CN"/>
-        </w:rPr>
-        <w:t xml:space="preserve">　　尔时世尊。又自思惟。彼王师大臣所遣。憍陈如等五人瞻视我者。皆悉聪明。又过去世。于我发愿应先闻法。我今宜当为此五人先开法门。又自思惟。古昔诸佛转法轮处。皆悉在于婆罗奈国鹿野苑中仙人住处又此五人。所止住处。亦在于彼。我今应往至其住处。转大法轮。思惟是已。即从座起。诣婆罗奈国。尔时有五百商人。二人为主。一名跋陀罗斯那。二名跋陀罗梨。行过旷野。时有天神。而语之言。有如来应供正遍知明行足善逝世间解无上士调御丈夫天人师佛世尊。出兴于世。最上福田。汝今宜应最前设供。时彼商人。闻天语已。即答之曰。善哉如告。又问天言。世尊今者为在何许。天又报言。世尊不久当来至此。于是如来。与无量诸天。前后导从。到多谓娑跋利村。时彼商人。既见如来威相庄严。又见诸天前后围绕。倍生欢喜。即以蜜麨。而奉上佛。尔时世尊。心自思惟。过去诸佛。用钵多罗。而以盛食。时四天王。知佛心念。各持一钵。来至佛所。而以奉上。于是世尊。而自念言。我今若受一王钵者。余王必当生于恨心。即便普受四王之钵。累置掌上。按令成一。使四际现。尔时世尊。即便咒愿。今所布施。欲令食者。得充气力。当令施者。得色得力。得胆得喜。安快无病。终保年寿。诸善鬼神。恒随守护。饭食布施。断三毒根。将来当获三坚法报。聪明智慧。笃信佛法。在在所生。正见不昧。现世之中。父母妻子。亲戚眷属。皆悉炽盛。无诸灾怪不吉祥事。门族之中。若有命过堕恶道者。当令以今所施之福还生人天。不起邪见。增进功德。常得奉近。诸佛如来。得闻妙说。见谛得证。所愿具足。</w:t>
-      </w:r>
-    </w:p>
-    <w:p>
-      <w:pPr>
-        <w:spacing w:after="0" w:line="240" w:lineRule="auto"/>
-        <w:jc w:val="both"/>
-        <w:rPr>
-          <w:sz w:val="24"/>
-          <w:szCs w:val="24"/>
-          <w:shd w:val="pct15" w:color="auto" w:fill="FFFFFF"/>
-          <w:lang w:eastAsia="zh-CN"/>
-        </w:rPr>
-      </w:pPr>
-      <w:r>
-        <w:rPr>
-          <w:sz w:val="24"/>
-          <w:szCs w:val="24"/>
-          <w:shd w:val="pct15" w:color="auto" w:fill="FFFFFF"/>
-          <w:lang w:eastAsia="zh-CN"/>
-        </w:rPr>
-        <w:t xml:space="preserve">　　尔时世尊。咒愿讫已。即便受食。食既毕竟。澡漱洗钵即授商人三归。一归依佛。二归依法。三归依将来僧。授三归竟。因与之别。而便前行威仪庠序步若鹅王。路逢外道。名优波伽。既见如来相好庄严。诸根寂定。叹为奇特。即说偈言。</w:t>
-      </w:r>
-    </w:p>
-    <w:p>
-      <w:pPr>
-        <w:spacing w:after="0" w:line="240" w:lineRule="auto"/>
-        <w:jc w:val="both"/>
-        <w:rPr>
-          <w:sz w:val="24"/>
-          <w:szCs w:val="24"/>
-          <w:shd w:val="pct15" w:color="auto" w:fill="FFFFFF"/>
-          <w:lang w:eastAsia="zh-CN"/>
-        </w:rPr>
-      </w:pPr>
-      <w:r>
-        <w:rPr>
-          <w:sz w:val="24"/>
-          <w:szCs w:val="24"/>
-          <w:shd w:val="pct15" w:color="auto" w:fill="FFFFFF"/>
-          <w:lang w:eastAsia="zh-CN"/>
-        </w:rPr>
-        <w:t xml:space="preserve">　　世间诸众生　　皆为三毒缚</w:t>
-      </w:r>
-    </w:p>
-    <w:p>
-      <w:pPr>
-        <w:spacing w:after="0" w:line="240" w:lineRule="auto"/>
-        <w:jc w:val="both"/>
-        <w:rPr>
-          <w:sz w:val="24"/>
-          <w:szCs w:val="24"/>
-          <w:shd w:val="pct15" w:color="auto" w:fill="FFFFFF"/>
-          <w:lang w:eastAsia="zh-CN"/>
-        </w:rPr>
-      </w:pPr>
-      <w:r>
-        <w:rPr>
-          <w:sz w:val="24"/>
-          <w:szCs w:val="24"/>
-          <w:shd w:val="pct15" w:color="auto" w:fill="FFFFFF"/>
-          <w:lang w:eastAsia="zh-CN"/>
-        </w:rPr>
-        <w:t xml:space="preserve">　　诸根又轻躁　　驰荡于外境</w:t>
-      </w:r>
-    </w:p>
-    <w:p>
-      <w:pPr>
-        <w:spacing w:after="0" w:line="240" w:lineRule="auto"/>
-        <w:jc w:val="both"/>
-        <w:rPr>
-          <w:sz w:val="24"/>
-          <w:szCs w:val="24"/>
-          <w:shd w:val="pct15" w:color="auto" w:fill="FFFFFF"/>
-          <w:lang w:eastAsia="zh-CN"/>
-        </w:rPr>
-      </w:pPr>
-      <w:r>
-        <w:rPr>
-          <w:sz w:val="24"/>
-          <w:szCs w:val="24"/>
-          <w:shd w:val="pct15" w:color="auto" w:fill="FFFFFF"/>
-          <w:lang w:eastAsia="zh-CN"/>
-        </w:rPr>
-        <w:t xml:space="preserve">　　而今见仁者　　诸根极寂静</w:t>
-      </w:r>
-    </w:p>
-    <w:p>
-      <w:pPr>
-        <w:spacing w:after="0" w:line="240" w:lineRule="auto"/>
-        <w:jc w:val="both"/>
-        <w:rPr>
-          <w:sz w:val="24"/>
-          <w:szCs w:val="24"/>
-          <w:shd w:val="pct15" w:color="auto" w:fill="FFFFFF"/>
-          <w:lang w:eastAsia="zh-CN"/>
-        </w:rPr>
-      </w:pPr>
-      <w:r>
-        <w:rPr>
-          <w:sz w:val="24"/>
-          <w:szCs w:val="24"/>
-          <w:shd w:val="pct15" w:color="auto" w:fill="FFFFFF"/>
-          <w:lang w:eastAsia="zh-CN"/>
-        </w:rPr>
-        <w:t xml:space="preserve">　　必到解脱地　　决定无有疑</w:t>
-      </w:r>
-    </w:p>
-    <w:p>
-      <w:pPr>
-        <w:spacing w:after="0" w:line="240" w:lineRule="auto"/>
-        <w:jc w:val="both"/>
-        <w:rPr>
-          <w:sz w:val="24"/>
-          <w:szCs w:val="24"/>
-          <w:shd w:val="pct15" w:color="auto" w:fill="FFFFFF"/>
-          <w:lang w:eastAsia="zh-CN"/>
-        </w:rPr>
-      </w:pPr>
-      <w:r>
-        <w:rPr>
-          <w:sz w:val="24"/>
-          <w:szCs w:val="24"/>
-          <w:shd w:val="pct15" w:color="auto" w:fill="FFFFFF"/>
-          <w:lang w:eastAsia="zh-CN"/>
-        </w:rPr>
-        <w:t xml:space="preserve">　　仁者所学师　　其姓字何等</w:t>
-      </w:r>
-    </w:p>
-    <w:p>
-      <w:pPr>
-        <w:spacing w:after="0" w:line="240" w:lineRule="auto"/>
-        <w:jc w:val="both"/>
-        <w:rPr>
-          <w:sz w:val="24"/>
-          <w:szCs w:val="24"/>
-          <w:shd w:val="pct15" w:color="auto" w:fill="FFFFFF"/>
-          <w:lang w:eastAsia="zh-CN"/>
-        </w:rPr>
-      </w:pPr>
     </w:p>
     <w:p>
       <w:pPr>
@@ -35697,7 +36345,7 @@
 </file>
 
 <file path=customXml/itemProps1.xml><?xml version="1.0" encoding="utf-8"?>
-<ds:datastoreItem xmlns:ds="http://schemas.openxmlformats.org/officeDocument/2006/customXml" ds:itemID="{72BA2E79-DB14-440A-BEBF-EE0C4E13F7B1}">
+<ds:datastoreItem xmlns:ds="http://schemas.openxmlformats.org/officeDocument/2006/customXml" ds:itemID="{1E3C3005-DB1F-4351-B312-6F2A2A2FC562}">
   <ds:schemaRefs>
     <ds:schemaRef ds:uri="http://schemas.openxmlformats.org/officeDocument/2006/bibliography"/>
   </ds:schemaRefs>

</xml_diff>